<commit_message>
Store daily recap us_market_recap_2026-10-13_BJT_us_2026-10-12_final
</commit_message>
<xml_diff>
--- a/reports/us_market_recap_2026-10-13_BJT_us_2026-10-12_final.docx
+++ b/reports/us_market_recap_2026-10-13_BJT_us_2026-10-12_final.docx
@@ -1767,7 +1767,7 @@
                 <w:color w:val="141414"/>
                 <w:sz w:val="16"/>
               </w:rPr>
-              <w:t>-2.04pp</w:t>
+              <w:t>-2.19pp</w:t>
             </w:r>
           </w:p>
         </w:tc>
@@ -1794,7 +1794,7 @@
                 <w:color w:val="141414"/>
                 <w:sz w:val="16"/>
               </w:rPr>
-              <w:t>-9.56pp</w:t>
+              <w:t>-9.71pp</w:t>
             </w:r>
           </w:p>
         </w:tc>
@@ -1821,7 +1821,7 @@
                 <w:color w:val="141414"/>
                 <w:sz w:val="16"/>
               </w:rPr>
-              <w:t>+1.57pp</w:t>
+              <w:t>+1.41pp</w:t>
             </w:r>
           </w:p>
         </w:tc>
@@ -1906,7 +1906,7 @@
                 <w:color w:val="141414"/>
                 <w:sz w:val="16"/>
               </w:rPr>
-              <w:t>+3.69pp</w:t>
+              <w:t>+3.51pp</w:t>
             </w:r>
           </w:p>
         </w:tc>
@@ -1933,7 +1933,7 @@
                 <w:color w:val="141414"/>
                 <w:sz w:val="16"/>
               </w:rPr>
-              <w:t>+9.31pp</w:t>
+              <w:t>+9.13pp</w:t>
             </w:r>
           </w:p>
         </w:tc>
@@ -1960,7 +1960,7 @@
                 <w:color w:val="141414"/>
                 <w:sz w:val="16"/>
               </w:rPr>
-              <w:t>+2.25pp</w:t>
+              <w:t>+2.06pp</w:t>
             </w:r>
           </w:p>
         </w:tc>
@@ -2045,7 +2045,7 @@
                 <w:color w:val="141414"/>
                 <w:sz w:val="16"/>
               </w:rPr>
-              <w:t>+1.66pp</w:t>
+              <w:t>+1.54pp</w:t>
             </w:r>
           </w:p>
         </w:tc>
@@ -2072,7 +2072,7 @@
                 <w:color w:val="141414"/>
                 <w:sz w:val="16"/>
               </w:rPr>
-              <w:t>+1.83pp</w:t>
+              <w:t>+1.71pp</w:t>
             </w:r>
           </w:p>
         </w:tc>
@@ -2099,7 +2099,7 @@
                 <w:color w:val="141414"/>
                 <w:sz w:val="16"/>
               </w:rPr>
-              <w:t>+8.91pp</w:t>
+              <w:t>+8.78pp</w:t>
             </w:r>
           </w:p>
         </w:tc>
@@ -2184,7 +2184,7 @@
                 <w:color w:val="141414"/>
                 <w:sz w:val="16"/>
               </w:rPr>
-              <w:t>-0.25pp</w:t>
+              <w:t>-0.26pp</w:t>
             </w:r>
           </w:p>
         </w:tc>
@@ -2211,7 +2211,7 @@
                 <w:color w:val="141414"/>
                 <w:sz w:val="16"/>
               </w:rPr>
-              <w:t>-2.44pp</w:t>
+              <w:t>-2.45pp</w:t>
             </w:r>
           </w:p>
         </w:tc>
@@ -2238,7 +2238,7 @@
                 <w:color w:val="141414"/>
                 <w:sz w:val="16"/>
               </w:rPr>
-              <w:t>+5.97pp</w:t>
+              <w:t>+5.95pp</w:t>
             </w:r>
           </w:p>
         </w:tc>
@@ -2323,7 +2323,7 @@
                 <w:color w:val="141414"/>
                 <w:sz w:val="16"/>
               </w:rPr>
-              <w:t>+0.12pp</w:t>
+              <w:t>+0.14pp</w:t>
             </w:r>
           </w:p>
         </w:tc>
@@ -2350,7 +2350,7 @@
                 <w:color w:val="141414"/>
                 <w:sz w:val="16"/>
               </w:rPr>
-              <w:t>-4.39pp</w:t>
+              <w:t>-4.38pp</w:t>
             </w:r>
           </w:p>
         </w:tc>
@@ -2377,7 +2377,7 @@
                 <w:color w:val="141414"/>
                 <w:sz w:val="16"/>
               </w:rPr>
-              <w:t>+4.17pp</w:t>
+              <w:t>+4.19pp</w:t>
             </w:r>
           </w:p>
         </w:tc>
@@ -2462,7 +2462,7 @@
                 <w:color w:val="141414"/>
                 <w:sz w:val="16"/>
               </w:rPr>
-              <w:t>+0.55pp</w:t>
+              <w:t>+0.49pp</w:t>
             </w:r>
           </w:p>
         </w:tc>
@@ -2489,7 +2489,7 @@
                 <w:color w:val="141414"/>
                 <w:sz w:val="16"/>
               </w:rPr>
-              <w:t>-1.93pp</w:t>
+              <w:t>-1.99pp</w:t>
             </w:r>
           </w:p>
         </w:tc>
@@ -2516,7 +2516,7 @@
                 <w:color w:val="141414"/>
                 <w:sz w:val="16"/>
               </w:rPr>
-              <w:t>-1.55pp</w:t>
+              <w:t>-1.61pp</w:t>
             </w:r>
           </w:p>
         </w:tc>
@@ -2542,7 +2542,7 @@
                 <w:color w:val="141414"/>
                 <w:sz w:val="16"/>
               </w:rPr>
-              <w:t>CONFIRMED</w:t>
+              <w:t>UNCLEAR</w:t>
             </w:r>
           </w:p>
         </w:tc>
@@ -2601,7 +2601,7 @@
                 <w:color w:val="141414"/>
                 <w:sz w:val="16"/>
               </w:rPr>
-              <w:t>-3.74pp</w:t>
+              <w:t>-3.78pp</w:t>
             </w:r>
           </w:p>
         </w:tc>
@@ -2628,7 +2628,7 @@
                 <w:color w:val="141414"/>
                 <w:sz w:val="16"/>
               </w:rPr>
-              <w:t>-9.94pp</w:t>
+              <w:t>-9.98pp</w:t>
             </w:r>
           </w:p>
         </w:tc>
@@ -2655,7 +2655,7 @@
                 <w:color w:val="141414"/>
                 <w:sz w:val="16"/>
               </w:rPr>
-              <w:t>+0.75pp</w:t>
+              <w:t>+0.71pp</w:t>
             </w:r>
           </w:p>
         </w:tc>
@@ -2740,7 +2740,7 @@
                 <w:color w:val="141414"/>
                 <w:sz w:val="16"/>
               </w:rPr>
-              <w:t>-1.01pp</w:t>
+              <w:t>-1.19pp</w:t>
             </w:r>
           </w:p>
         </w:tc>
@@ -2767,7 +2767,7 @@
                 <w:color w:val="141414"/>
                 <w:sz w:val="16"/>
               </w:rPr>
-              <w:t>-5.70pp</w:t>
+              <w:t>-5.88pp</w:t>
             </w:r>
           </w:p>
         </w:tc>
@@ -2794,7 +2794,7 @@
                 <w:color w:val="141414"/>
                 <w:sz w:val="16"/>
               </w:rPr>
-              <w:t>+3.59pp</w:t>
+              <w:t>+3.40pp</w:t>
             </w:r>
           </w:p>
         </w:tc>
@@ -2879,7 +2879,7 @@
                 <w:color w:val="141414"/>
                 <w:sz w:val="16"/>
               </w:rPr>
-              <w:t>-0.45pp</w:t>
+              <w:t>-0.34pp</w:t>
             </w:r>
           </w:p>
         </w:tc>
@@ -2906,7 +2906,7 @@
                 <w:color w:val="141414"/>
                 <w:sz w:val="16"/>
               </w:rPr>
-              <w:t>-1.54pp</w:t>
+              <w:t>-1.43pp</w:t>
             </w:r>
           </w:p>
         </w:tc>
@@ -2933,7 +2933,7 @@
                 <w:color w:val="141414"/>
                 <w:sz w:val="16"/>
               </w:rPr>
-              <w:t>-5.71pp</w:t>
+              <w:t>-5.60pp</w:t>
             </w:r>
           </w:p>
         </w:tc>
@@ -5927,7 +5927,7 @@
                 <w:color w:val="141414"/>
                 <w:sz w:val="16"/>
               </w:rPr>
-              <w:t>2.55</w:t>
+              <w:t>2.47</w:t>
             </w:r>
           </w:p>
         </w:tc>
@@ -5953,7 +5953,7 @@
                 <w:color w:val="141414"/>
                 <w:sz w:val="16"/>
               </w:rPr>
-              <w:t>13.7%</w:t>
+              <w:t>12.6%</w:t>
             </w:r>
           </w:p>
         </w:tc>
@@ -6063,7 +6063,7 @@
                 <w:color w:val="141414"/>
                 <w:sz w:val="16"/>
               </w:rPr>
-              <w:t>1.03</w:t>
+              <w:t>0.98</w:t>
             </w:r>
           </w:p>
         </w:tc>
@@ -6089,7 +6089,7 @@
                 <w:color w:val="141414"/>
                 <w:sz w:val="16"/>
               </w:rPr>
-              <w:t>15.3%</w:t>
+              <w:t>16.8%</w:t>
             </w:r>
           </w:p>
         </w:tc>
@@ -6199,7 +6199,7 @@
                 <w:color w:val="141414"/>
                 <w:sz w:val="16"/>
               </w:rPr>
-              <w:t>1.64</w:t>
+              <w:t>1.15</w:t>
             </w:r>
           </w:p>
         </w:tc>
@@ -6225,7 +6225,7 @@
                 <w:color w:val="141414"/>
                 <w:sz w:val="16"/>
               </w:rPr>
-              <w:t>22.0%</w:t>
+              <w:t>18.4%</w:t>
             </w:r>
           </w:p>
         </w:tc>
@@ -6335,7 +6335,7 @@
                 <w:color w:val="141414"/>
                 <w:sz w:val="16"/>
               </w:rPr>
-              <w:t>2.29</w:t>
+              <w:t>2.16</w:t>
             </w:r>
           </w:p>
         </w:tc>
@@ -6361,7 +6361,7 @@
                 <w:color w:val="141414"/>
                 <w:sz w:val="16"/>
               </w:rPr>
-              <w:t>19.5%</w:t>
+              <w:t>17.6%</w:t>
             </w:r>
           </w:p>
         </w:tc>
@@ -6471,7 +6471,7 @@
                 <w:color w:val="141414"/>
                 <w:sz w:val="16"/>
               </w:rPr>
-              <w:t>1.84</w:t>
+              <w:t>1.67</w:t>
             </w:r>
           </w:p>
         </w:tc>
@@ -6497,7 +6497,7 @@
                 <w:color w:val="141414"/>
                 <w:sz w:val="16"/>
               </w:rPr>
-              <w:t>11.2%</w:t>
+              <w:t>10.4%</w:t>
             </w:r>
           </w:p>
         </w:tc>
@@ -6607,7 +6607,7 @@
                 <w:color w:val="141414"/>
                 <w:sz w:val="16"/>
               </w:rPr>
-              <w:t>1.94</w:t>
+              <w:t>1.80</w:t>
             </w:r>
           </w:p>
         </w:tc>
@@ -6633,7 +6633,7 @@
                 <w:color w:val="141414"/>
                 <w:sz w:val="16"/>
               </w:rPr>
-              <w:t>7.7%</w:t>
+              <w:t>7.2%</w:t>
             </w:r>
           </w:p>
         </w:tc>
@@ -6659,7 +6659,7 @@
                 <w:color w:val="141414"/>
                 <w:sz w:val="16"/>
               </w:rPr>
-              <w:t>无阈值报警</w:t>
+              <w:t>strike-concentration</w:t>
             </w:r>
           </w:p>
         </w:tc>
@@ -6743,7 +6743,7 @@
                 <w:color w:val="141414"/>
                 <w:sz w:val="16"/>
               </w:rPr>
-              <w:t>1.08</w:t>
+              <w:t>1.04</w:t>
             </w:r>
           </w:p>
         </w:tc>
@@ -6769,7 +6769,7 @@
                 <w:color w:val="141414"/>
                 <w:sz w:val="16"/>
               </w:rPr>
-              <w:t>23.0%</w:t>
+              <w:t>23.4%</w:t>
             </w:r>
           </w:p>
         </w:tc>
@@ -6879,7 +6879,7 @@
                 <w:color w:val="141414"/>
                 <w:sz w:val="16"/>
               </w:rPr>
-              <w:t>1.31</w:t>
+              <w:t>1.26</w:t>
             </w:r>
           </w:p>
         </w:tc>
@@ -6905,7 +6905,7 @@
                 <w:color w:val="141414"/>
                 <w:sz w:val="16"/>
               </w:rPr>
-              <w:t>14.0%</w:t>
+              <w:t>14.1%</w:t>
             </w:r>
           </w:p>
         </w:tc>
@@ -6931,7 +6931,7 @@
                 <w:color w:val="141414"/>
                 <w:sz w:val="16"/>
               </w:rPr>
-              <w:t>strike-concentration</w:t>
+              <w:t>无阈值报警</w:t>
             </w:r>
           </w:p>
         </w:tc>
@@ -7015,7 +7015,7 @@
                 <w:color w:val="141414"/>
                 <w:sz w:val="16"/>
               </w:rPr>
-              <w:t>1.90</w:t>
+              <w:t>1.86</w:t>
             </w:r>
           </w:p>
         </w:tc>
@@ -7041,7 +7041,7 @@
                 <w:color w:val="141414"/>
                 <w:sz w:val="16"/>
               </w:rPr>
-              <w:t>10.9%</w:t>
+              <w:t>11.0%</w:t>
             </w:r>
           </w:p>
         </w:tc>
@@ -7151,7 +7151,7 @@
                 <w:color w:val="141414"/>
                 <w:sz w:val="16"/>
               </w:rPr>
-              <w:t>1.55</w:t>
+              <w:t>1.44</w:t>
             </w:r>
           </w:p>
         </w:tc>
@@ -7177,7 +7177,7 @@
                 <w:color w:val="141414"/>
                 <w:sz w:val="16"/>
               </w:rPr>
-              <w:t>16.6%</w:t>
+              <w:t>14.0%</w:t>
             </w:r>
           </w:p>
         </w:tc>
@@ -7287,7 +7287,7 @@
                 <w:color w:val="141414"/>
                 <w:sz w:val="16"/>
               </w:rPr>
-              <w:t>0.62</w:t>
+              <w:t>0.61</w:t>
             </w:r>
           </w:p>
         </w:tc>
@@ -7313,7 +7313,7 @@
                 <w:color w:val="141414"/>
                 <w:sz w:val="16"/>
               </w:rPr>
-              <w:t>52.4%</w:t>
+              <w:t>46.0%</w:t>
             </w:r>
           </w:p>
         </w:tc>
@@ -7423,7 +7423,7 @@
                 <w:color w:val="141414"/>
                 <w:sz w:val="16"/>
               </w:rPr>
-              <w:t>1.65</w:t>
+              <w:t>1.69</w:t>
             </w:r>
           </w:p>
         </w:tc>
@@ -7449,7 +7449,7 @@
                 <w:color w:val="141414"/>
                 <w:sz w:val="16"/>
               </w:rPr>
-              <w:t>9.3%</w:t>
+              <w:t>10.2%</w:t>
             </w:r>
           </w:p>
         </w:tc>
@@ -7475,7 +7475,7 @@
                 <w:color w:val="141414"/>
                 <w:sz w:val="16"/>
               </w:rPr>
-              <w:t>无阈值报警</w:t>
+              <w:t>put-heavy, strike-concentration</w:t>
             </w:r>
           </w:p>
         </w:tc>
@@ -7559,7 +7559,7 @@
                 <w:color w:val="141414"/>
                 <w:sz w:val="16"/>
               </w:rPr>
-              <w:t>1.53</w:t>
+              <w:t>1.41</w:t>
             </w:r>
           </w:p>
         </w:tc>
@@ -7695,7 +7695,7 @@
                 <w:color w:val="141414"/>
                 <w:sz w:val="16"/>
               </w:rPr>
-              <w:t>5.52</w:t>
+              <w:t>5.46</w:t>
             </w:r>
           </w:p>
         </w:tc>
@@ -7721,7 +7721,7 @@
                 <w:color w:val="141414"/>
                 <w:sz w:val="16"/>
               </w:rPr>
-              <w:t>10.6%</w:t>
+              <w:t>10.5%</w:t>
             </w:r>
           </w:p>
         </w:tc>
@@ -7747,7 +7747,7 @@
                 <w:color w:val="141414"/>
                 <w:sz w:val="16"/>
               </w:rPr>
-              <w:t>call-heavy, strike-concentration</w:t>
+              <w:t>call-heavy</w:t>
             </w:r>
           </w:p>
         </w:tc>
@@ -7766,7 +7766,7 @@
       <w:r>
         <w:drawing>
           <wp:inline xmlns:a="http://schemas.openxmlformats.org/drawingml/2006/main" xmlns:pic="http://schemas.openxmlformats.org/drawingml/2006/picture">
-            <wp:extent cx="5806440" cy="3196988"/>
+            <wp:extent cx="5806440" cy="3433316"/>
             <wp:docPr id="10" name="Picture 10"/>
             <wp:cNvGraphicFramePr>
               <a:graphicFrameLocks noChangeAspect="1"/>
@@ -7787,7 +7787,7 @@
                   <pic:spPr>
                     <a:xfrm>
                       <a:off x="0" y="0"/>
-                      <a:ext cx="5806440" cy="3196988"/>
+                      <a:ext cx="5806440" cy="3433316"/>
                     </a:xfrm>
                     <a:prstGeom prst="rect"/>
                   </pic:spPr>

</xml_diff>

<commit_message>
Store daily recap Word us_market_recap_2026-10-13_BJT_us_2026-10-12_final
</commit_message>
<xml_diff>
--- a/reports/us_market_recap_2026-10-13_BJT_us_2026-10-12_final.docx
+++ b/reports/us_market_recap_2026-10-13_BJT_us_2026-10-12_final.docx
@@ -1767,7 +1767,7 @@
                 <w:color w:val="141414"/>
                 <w:sz w:val="16"/>
               </w:rPr>
-              <w:t>-2.19pp</w:t>
+              <w:t>-2.04pp</w:t>
             </w:r>
           </w:p>
         </w:tc>
@@ -1794,7 +1794,7 @@
                 <w:color w:val="141414"/>
                 <w:sz w:val="16"/>
               </w:rPr>
-              <w:t>-9.71pp</w:t>
+              <w:t>-9.56pp</w:t>
             </w:r>
           </w:p>
         </w:tc>
@@ -1821,7 +1821,7 @@
                 <w:color w:val="141414"/>
                 <w:sz w:val="16"/>
               </w:rPr>
-              <w:t>+1.41pp</w:t>
+              <w:t>+1.57pp</w:t>
             </w:r>
           </w:p>
         </w:tc>
@@ -1906,7 +1906,7 @@
                 <w:color w:val="141414"/>
                 <w:sz w:val="16"/>
               </w:rPr>
-              <w:t>+3.51pp</w:t>
+              <w:t>+3.69pp</w:t>
             </w:r>
           </w:p>
         </w:tc>
@@ -1933,7 +1933,7 @@
                 <w:color w:val="141414"/>
                 <w:sz w:val="16"/>
               </w:rPr>
-              <w:t>+9.13pp</w:t>
+              <w:t>+9.31pp</w:t>
             </w:r>
           </w:p>
         </w:tc>
@@ -1960,7 +1960,7 @@
                 <w:color w:val="141414"/>
                 <w:sz w:val="16"/>
               </w:rPr>
-              <w:t>+2.06pp</w:t>
+              <w:t>+2.25pp</w:t>
             </w:r>
           </w:p>
         </w:tc>
@@ -2045,7 +2045,7 @@
                 <w:color w:val="141414"/>
                 <w:sz w:val="16"/>
               </w:rPr>
-              <w:t>+1.54pp</w:t>
+              <w:t>+1.66pp</w:t>
             </w:r>
           </w:p>
         </w:tc>
@@ -2072,7 +2072,7 @@
                 <w:color w:val="141414"/>
                 <w:sz w:val="16"/>
               </w:rPr>
-              <w:t>+1.71pp</w:t>
+              <w:t>+1.83pp</w:t>
             </w:r>
           </w:p>
         </w:tc>
@@ -2099,7 +2099,7 @@
                 <w:color w:val="141414"/>
                 <w:sz w:val="16"/>
               </w:rPr>
-              <w:t>+8.78pp</w:t>
+              <w:t>+8.91pp</w:t>
             </w:r>
           </w:p>
         </w:tc>
@@ -2184,7 +2184,7 @@
                 <w:color w:val="141414"/>
                 <w:sz w:val="16"/>
               </w:rPr>
-              <w:t>-0.26pp</w:t>
+              <w:t>-0.25pp</w:t>
             </w:r>
           </w:p>
         </w:tc>
@@ -2211,7 +2211,7 @@
                 <w:color w:val="141414"/>
                 <w:sz w:val="16"/>
               </w:rPr>
-              <w:t>-2.45pp</w:t>
+              <w:t>-2.44pp</w:t>
             </w:r>
           </w:p>
         </w:tc>
@@ -2238,7 +2238,7 @@
                 <w:color w:val="141414"/>
                 <w:sz w:val="16"/>
               </w:rPr>
-              <w:t>+5.95pp</w:t>
+              <w:t>+5.97pp</w:t>
             </w:r>
           </w:p>
         </w:tc>
@@ -2323,7 +2323,7 @@
                 <w:color w:val="141414"/>
                 <w:sz w:val="16"/>
               </w:rPr>
-              <w:t>+0.14pp</w:t>
+              <w:t>+0.12pp</w:t>
             </w:r>
           </w:p>
         </w:tc>
@@ -2350,7 +2350,7 @@
                 <w:color w:val="141414"/>
                 <w:sz w:val="16"/>
               </w:rPr>
-              <w:t>-4.38pp</w:t>
+              <w:t>-4.39pp</w:t>
             </w:r>
           </w:p>
         </w:tc>
@@ -2377,7 +2377,7 @@
                 <w:color w:val="141414"/>
                 <w:sz w:val="16"/>
               </w:rPr>
-              <w:t>+4.19pp</w:t>
+              <w:t>+4.17pp</w:t>
             </w:r>
           </w:p>
         </w:tc>
@@ -2462,7 +2462,7 @@
                 <w:color w:val="141414"/>
                 <w:sz w:val="16"/>
               </w:rPr>
-              <w:t>+0.49pp</w:t>
+              <w:t>+0.55pp</w:t>
             </w:r>
           </w:p>
         </w:tc>
@@ -2489,7 +2489,7 @@
                 <w:color w:val="141414"/>
                 <w:sz w:val="16"/>
               </w:rPr>
-              <w:t>-1.99pp</w:t>
+              <w:t>-1.93pp</w:t>
             </w:r>
           </w:p>
         </w:tc>
@@ -2516,7 +2516,7 @@
                 <w:color w:val="141414"/>
                 <w:sz w:val="16"/>
               </w:rPr>
-              <w:t>-1.61pp</w:t>
+              <w:t>-1.55pp</w:t>
             </w:r>
           </w:p>
         </w:tc>
@@ -2542,7 +2542,7 @@
                 <w:color w:val="141414"/>
                 <w:sz w:val="16"/>
               </w:rPr>
-              <w:t>UNCLEAR</w:t>
+              <w:t>CONFIRMED</w:t>
             </w:r>
           </w:p>
         </w:tc>
@@ -2601,7 +2601,7 @@
                 <w:color w:val="141414"/>
                 <w:sz w:val="16"/>
               </w:rPr>
-              <w:t>-3.78pp</w:t>
+              <w:t>-3.74pp</w:t>
             </w:r>
           </w:p>
         </w:tc>
@@ -2628,7 +2628,7 @@
                 <w:color w:val="141414"/>
                 <w:sz w:val="16"/>
               </w:rPr>
-              <w:t>-9.98pp</w:t>
+              <w:t>-9.94pp</w:t>
             </w:r>
           </w:p>
         </w:tc>
@@ -2655,7 +2655,7 @@
                 <w:color w:val="141414"/>
                 <w:sz w:val="16"/>
               </w:rPr>
-              <w:t>+0.71pp</w:t>
+              <w:t>+0.75pp</w:t>
             </w:r>
           </w:p>
         </w:tc>
@@ -2740,7 +2740,7 @@
                 <w:color w:val="141414"/>
                 <w:sz w:val="16"/>
               </w:rPr>
-              <w:t>-1.19pp</w:t>
+              <w:t>-1.01pp</w:t>
             </w:r>
           </w:p>
         </w:tc>
@@ -2767,7 +2767,7 @@
                 <w:color w:val="141414"/>
                 <w:sz w:val="16"/>
               </w:rPr>
-              <w:t>-5.88pp</w:t>
+              <w:t>-5.70pp</w:t>
             </w:r>
           </w:p>
         </w:tc>
@@ -2794,7 +2794,7 @@
                 <w:color w:val="141414"/>
                 <w:sz w:val="16"/>
               </w:rPr>
-              <w:t>+3.40pp</w:t>
+              <w:t>+3.59pp</w:t>
             </w:r>
           </w:p>
         </w:tc>
@@ -2879,7 +2879,7 @@
                 <w:color w:val="141414"/>
                 <w:sz w:val="16"/>
               </w:rPr>
-              <w:t>-0.34pp</w:t>
+              <w:t>-0.45pp</w:t>
             </w:r>
           </w:p>
         </w:tc>
@@ -2906,7 +2906,7 @@
                 <w:color w:val="141414"/>
                 <w:sz w:val="16"/>
               </w:rPr>
-              <w:t>-1.43pp</w:t>
+              <w:t>-1.54pp</w:t>
             </w:r>
           </w:p>
         </w:tc>
@@ -2933,7 +2933,7 @@
                 <w:color w:val="141414"/>
                 <w:sz w:val="16"/>
               </w:rPr>
-              <w:t>-5.60pp</w:t>
+              <w:t>-5.71pp</w:t>
             </w:r>
           </w:p>
         </w:tc>
@@ -5927,7 +5927,7 @@
                 <w:color w:val="141414"/>
                 <w:sz w:val="16"/>
               </w:rPr>
-              <w:t>2.47</w:t>
+              <w:t>2.55</w:t>
             </w:r>
           </w:p>
         </w:tc>
@@ -5953,7 +5953,7 @@
                 <w:color w:val="141414"/>
                 <w:sz w:val="16"/>
               </w:rPr>
-              <w:t>12.6%</w:t>
+              <w:t>13.7%</w:t>
             </w:r>
           </w:p>
         </w:tc>
@@ -6063,7 +6063,7 @@
                 <w:color w:val="141414"/>
                 <w:sz w:val="16"/>
               </w:rPr>
-              <w:t>0.98</w:t>
+              <w:t>1.03</w:t>
             </w:r>
           </w:p>
         </w:tc>
@@ -6089,7 +6089,7 @@
                 <w:color w:val="141414"/>
                 <w:sz w:val="16"/>
               </w:rPr>
-              <w:t>16.8%</w:t>
+              <w:t>15.3%</w:t>
             </w:r>
           </w:p>
         </w:tc>
@@ -6199,7 +6199,7 @@
                 <w:color w:val="141414"/>
                 <w:sz w:val="16"/>
               </w:rPr>
-              <w:t>1.15</w:t>
+              <w:t>1.64</w:t>
             </w:r>
           </w:p>
         </w:tc>
@@ -6225,7 +6225,7 @@
                 <w:color w:val="141414"/>
                 <w:sz w:val="16"/>
               </w:rPr>
-              <w:t>18.4%</w:t>
+              <w:t>22.0%</w:t>
             </w:r>
           </w:p>
         </w:tc>
@@ -6335,7 +6335,7 @@
                 <w:color w:val="141414"/>
                 <w:sz w:val="16"/>
               </w:rPr>
-              <w:t>2.16</w:t>
+              <w:t>2.29</w:t>
             </w:r>
           </w:p>
         </w:tc>
@@ -6361,7 +6361,7 @@
                 <w:color w:val="141414"/>
                 <w:sz w:val="16"/>
               </w:rPr>
-              <w:t>17.6%</w:t>
+              <w:t>19.5%</w:t>
             </w:r>
           </w:p>
         </w:tc>
@@ -6471,7 +6471,7 @@
                 <w:color w:val="141414"/>
                 <w:sz w:val="16"/>
               </w:rPr>
-              <w:t>1.67</w:t>
+              <w:t>1.84</w:t>
             </w:r>
           </w:p>
         </w:tc>
@@ -6497,7 +6497,7 @@
                 <w:color w:val="141414"/>
                 <w:sz w:val="16"/>
               </w:rPr>
-              <w:t>10.4%</w:t>
+              <w:t>11.2%</w:t>
             </w:r>
           </w:p>
         </w:tc>
@@ -6607,7 +6607,7 @@
                 <w:color w:val="141414"/>
                 <w:sz w:val="16"/>
               </w:rPr>
-              <w:t>1.80</w:t>
+              <w:t>1.94</w:t>
             </w:r>
           </w:p>
         </w:tc>
@@ -6633,7 +6633,7 @@
                 <w:color w:val="141414"/>
                 <w:sz w:val="16"/>
               </w:rPr>
-              <w:t>7.2%</w:t>
+              <w:t>7.7%</w:t>
             </w:r>
           </w:p>
         </w:tc>
@@ -6659,7 +6659,7 @@
                 <w:color w:val="141414"/>
                 <w:sz w:val="16"/>
               </w:rPr>
-              <w:t>strike-concentration</w:t>
+              <w:t>无阈值报警</w:t>
             </w:r>
           </w:p>
         </w:tc>
@@ -6743,7 +6743,7 @@
                 <w:color w:val="141414"/>
                 <w:sz w:val="16"/>
               </w:rPr>
-              <w:t>1.04</w:t>
+              <w:t>1.08</w:t>
             </w:r>
           </w:p>
         </w:tc>
@@ -6769,7 +6769,7 @@
                 <w:color w:val="141414"/>
                 <w:sz w:val="16"/>
               </w:rPr>
-              <w:t>23.4%</w:t>
+              <w:t>23.0%</w:t>
             </w:r>
           </w:p>
         </w:tc>
@@ -6879,7 +6879,7 @@
                 <w:color w:val="141414"/>
                 <w:sz w:val="16"/>
               </w:rPr>
-              <w:t>1.26</w:t>
+              <w:t>1.31</w:t>
             </w:r>
           </w:p>
         </w:tc>
@@ -6905,7 +6905,7 @@
                 <w:color w:val="141414"/>
                 <w:sz w:val="16"/>
               </w:rPr>
-              <w:t>14.1%</w:t>
+              <w:t>14.0%</w:t>
             </w:r>
           </w:p>
         </w:tc>
@@ -6931,7 +6931,7 @@
                 <w:color w:val="141414"/>
                 <w:sz w:val="16"/>
               </w:rPr>
-              <w:t>无阈值报警</w:t>
+              <w:t>strike-concentration</w:t>
             </w:r>
           </w:p>
         </w:tc>
@@ -7015,7 +7015,7 @@
                 <w:color w:val="141414"/>
                 <w:sz w:val="16"/>
               </w:rPr>
-              <w:t>1.86</w:t>
+              <w:t>1.90</w:t>
             </w:r>
           </w:p>
         </w:tc>
@@ -7041,7 +7041,7 @@
                 <w:color w:val="141414"/>
                 <w:sz w:val="16"/>
               </w:rPr>
-              <w:t>11.0%</w:t>
+              <w:t>10.9%</w:t>
             </w:r>
           </w:p>
         </w:tc>
@@ -7151,7 +7151,7 @@
                 <w:color w:val="141414"/>
                 <w:sz w:val="16"/>
               </w:rPr>
-              <w:t>1.44</w:t>
+              <w:t>1.55</w:t>
             </w:r>
           </w:p>
         </w:tc>
@@ -7177,7 +7177,7 @@
                 <w:color w:val="141414"/>
                 <w:sz w:val="16"/>
               </w:rPr>
-              <w:t>14.0%</w:t>
+              <w:t>16.6%</w:t>
             </w:r>
           </w:p>
         </w:tc>
@@ -7287,7 +7287,7 @@
                 <w:color w:val="141414"/>
                 <w:sz w:val="16"/>
               </w:rPr>
-              <w:t>0.61</w:t>
+              <w:t>0.62</w:t>
             </w:r>
           </w:p>
         </w:tc>
@@ -7313,7 +7313,7 @@
                 <w:color w:val="141414"/>
                 <w:sz w:val="16"/>
               </w:rPr>
-              <w:t>46.0%</w:t>
+              <w:t>52.4%</w:t>
             </w:r>
           </w:p>
         </w:tc>
@@ -7423,7 +7423,7 @@
                 <w:color w:val="141414"/>
                 <w:sz w:val="16"/>
               </w:rPr>
-              <w:t>1.69</w:t>
+              <w:t>1.65</w:t>
             </w:r>
           </w:p>
         </w:tc>
@@ -7449,7 +7449,7 @@
                 <w:color w:val="141414"/>
                 <w:sz w:val="16"/>
               </w:rPr>
-              <w:t>10.2%</w:t>
+              <w:t>9.3%</w:t>
             </w:r>
           </w:p>
         </w:tc>
@@ -7475,7 +7475,7 @@
                 <w:color w:val="141414"/>
                 <w:sz w:val="16"/>
               </w:rPr>
-              <w:t>put-heavy, strike-concentration</w:t>
+              <w:t>无阈值报警</w:t>
             </w:r>
           </w:p>
         </w:tc>
@@ -7559,7 +7559,7 @@
                 <w:color w:val="141414"/>
                 <w:sz w:val="16"/>
               </w:rPr>
-              <w:t>1.41</w:t>
+              <w:t>1.53</w:t>
             </w:r>
           </w:p>
         </w:tc>
@@ -7695,7 +7695,7 @@
                 <w:color w:val="141414"/>
                 <w:sz w:val="16"/>
               </w:rPr>
-              <w:t>5.46</w:t>
+              <w:t>5.52</w:t>
             </w:r>
           </w:p>
         </w:tc>
@@ -7721,7 +7721,7 @@
                 <w:color w:val="141414"/>
                 <w:sz w:val="16"/>
               </w:rPr>
-              <w:t>10.5%</w:t>
+              <w:t>10.6%</w:t>
             </w:r>
           </w:p>
         </w:tc>
@@ -7747,7 +7747,7 @@
                 <w:color w:val="141414"/>
                 <w:sz w:val="16"/>
               </w:rPr>
-              <w:t>call-heavy</w:t>
+              <w:t>call-heavy, strike-concentration</w:t>
             </w:r>
           </w:p>
         </w:tc>
@@ -7766,7 +7766,7 @@
       <w:r>
         <w:drawing>
           <wp:inline xmlns:a="http://schemas.openxmlformats.org/drawingml/2006/main" xmlns:pic="http://schemas.openxmlformats.org/drawingml/2006/picture">
-            <wp:extent cx="5806440" cy="3433316"/>
+            <wp:extent cx="5806440" cy="3196988"/>
             <wp:docPr id="10" name="Picture 10"/>
             <wp:cNvGraphicFramePr>
               <a:graphicFrameLocks noChangeAspect="1"/>
@@ -7787,7 +7787,7 @@
                   <pic:spPr>
                     <a:xfrm>
                       <a:off x="0" y="0"/>
-                      <a:ext cx="5806440" cy="3433316"/>
+                      <a:ext cx="5806440" cy="3196988"/>
                     </a:xfrm>
                     <a:prstGeom prst="rect"/>
                   </pic:spPr>

</xml_diff>